<commit_message>
Tangani error 419 Page Expired dengan pesan yang jelas
</commit_message>
<xml_diff>
--- a/DOKUMENTASI.docx
+++ b/DOKUMENTASI.docx
@@ -21981,7 +21981,7 @@
                 <w:sz w:val="19"/>
                 <w:szCs w:val="19"/>
               </w:rPr>
-              <w:t xml:space="preserve">Bagian 10: 62 test (unit + fitur) dengan PHPUnit, semua lulus di SQLite dan PostgreSQL.</w:t>
+              <w:t xml:space="preserve">Bagian 10: 65 test (unit + fitur) dengan PHPUnit, semua lulus di SQLite dan PostgreSQL.</w:t>
             </w:r>
           </w:p>
         </w:tc>
@@ -25488,6 +25488,157 @@
           </w:p>
         </w:tc>
       </w:tr>
+      <w:tr>
+        <w:trPr>
+          <w:tblHeader w:val="off"/>
+        </w:trPr>
+        <w:tc>
+          <w:tcPr>
+            <w:tcW w:type="dxa" w:w="255"/>
+            <w:tcBorders>
+              <w:top w:val="single" w:color="BFBFBF" w:sz="4"/>
+              <w:left w:val="single" w:color="BFBFBF" w:sz="4"/>
+              <w:bottom w:val="single" w:color="BFBFBF" w:sz="4"/>
+              <w:right w:val="single" w:color="BFBFBF" w:sz="4"/>
+            </w:tcBorders>
+            <w:tcMar>
+              <w:top w:type="dxa" w:w="60"/>
+              <w:left w:type="dxa" w:w="100"/>
+              <w:bottom w:type="dxa" w:w="60"/>
+              <w:right w:type="dxa" w:w="100"/>
+            </w:tcMar>
+          </w:tcPr>
+          <w:p>
+            <w:r>
+              <w:rPr>
+                <w:sz w:val="19"/>
+                <w:szCs w:val="19"/>
+              </w:rPr>
+              <w:t xml:space="preserve">14</w:t>
+            </w:r>
+          </w:p>
+        </w:tc>
+        <w:tc>
+          <w:tcPr>
+            <w:tcW w:type="dxa" w:w="1705"/>
+            <w:tcBorders>
+              <w:top w:val="single" w:color="BFBFBF" w:sz="4"/>
+              <w:left w:val="single" w:color="BFBFBF" w:sz="4"/>
+              <w:bottom w:val="single" w:color="BFBFBF" w:sz="4"/>
+              <w:right w:val="single" w:color="BFBFBF" w:sz="4"/>
+            </w:tcBorders>
+            <w:tcMar>
+              <w:top w:type="dxa" w:w="60"/>
+              <w:left w:type="dxa" w:w="100"/>
+              <w:bottom w:type="dxa" w:w="60"/>
+              <w:right w:type="dxa" w:w="100"/>
+            </w:tcMar>
+          </w:tcPr>
+          <w:p>
+            <w:r>
+              <w:rPr>
+                <w:sz w:val="19"/>
+                <w:szCs w:val="19"/>
+              </w:rPr>
+              <w:t xml:space="preserve">Formulir yang dibuka terlalu lama</w:t>
+            </w:r>
+          </w:p>
+        </w:tc>
+        <w:tc>
+          <w:tcPr>
+            <w:tcW w:type="dxa" w:w="2558"/>
+            <w:tcBorders>
+              <w:top w:val="single" w:color="BFBFBF" w:sz="4"/>
+              <w:left w:val="single" w:color="BFBFBF" w:sz="4"/>
+              <w:bottom w:val="single" w:color="BFBFBF" w:sz="4"/>
+              <w:right w:val="single" w:color="BFBFBF" w:sz="4"/>
+            </w:tcBorders>
+            <w:tcMar>
+              <w:top w:type="dxa" w:w="60"/>
+              <w:left w:type="dxa" w:w="100"/>
+              <w:bottom w:type="dxa" w:w="60"/>
+              <w:right w:type="dxa" w:w="100"/>
+            </w:tcMar>
+          </w:tcPr>
+          <w:p>
+            <w:r>
+              <w:rPr>
+                <w:sz w:val="19"/>
+                <w:szCs w:val="19"/>
+              </w:rPr>
+              <w:t xml:space="preserve">Token CSRF kedaluwarsa setelah masa sesi (120 menit) habis</w:t>
+            </w:r>
+          </w:p>
+        </w:tc>
+        <w:tc>
+          <w:tcPr>
+            <w:tcW w:type="dxa" w:w="2558"/>
+            <w:tcBorders>
+              <w:top w:val="single" w:color="BFBFBF" w:sz="4"/>
+              <w:left w:val="single" w:color="BFBFBF" w:sz="4"/>
+              <w:bottom w:val="single" w:color="BFBFBF" w:sz="4"/>
+              <w:right w:val="single" w:color="BFBFBF" w:sz="4"/>
+            </w:tcBorders>
+            <w:tcMar>
+              <w:top w:type="dxa" w:w="60"/>
+              <w:left w:type="dxa" w:w="100"/>
+              <w:bottom w:type="dxa" w:w="60"/>
+              <w:right w:type="dxa" w:w="100"/>
+            </w:tcMar>
+          </w:tcPr>
+          <w:p>
+            <w:r>
+              <w:rPr>
+                <w:sz w:val="19"/>
+                <w:szCs w:val="19"/>
+              </w:rPr>
+              <w:t xml:space="preserve">Pengguna mendapat halaman "419 Page Expired" yang membingungkan dan isian formulir hilang</w:t>
+            </w:r>
+          </w:p>
+        </w:tc>
+        <w:tc>
+          <w:tcPr>
+            <w:tcW w:type="dxa" w:w="2562"/>
+            <w:tcBorders>
+              <w:top w:val="single" w:color="BFBFBF" w:sz="4"/>
+              <w:left w:val="single" w:color="BFBFBF" w:sz="4"/>
+              <w:bottom w:val="single" w:color="BFBFBF" w:sz="4"/>
+              <w:right w:val="single" w:color="BFBFBF" w:sz="4"/>
+            </w:tcBorders>
+            <w:tcMar>
+              <w:top w:type="dxa" w:w="60"/>
+              <w:left w:type="dxa" w:w="100"/>
+              <w:bottom w:type="dxa" w:w="60"/>
+              <w:right w:type="dxa" w:w="100"/>
+            </w:tcMar>
+          </w:tcPr>
+          <w:p>
+            <w:r>
+              <w:rPr>
+                <w:sz w:val="19"/>
+                <w:szCs w:val="19"/>
+              </w:rPr>
+              <w:t xml:space="preserve">Error 419 ditangani di </w:t>
+            </w:r>
+            <w:r>
+              <w:rPr>
+                <w:rFonts w:ascii="Consolas" w:cs="Consolas" w:eastAsia="Consolas" w:hAnsi="Consolas"/>
+                <w:color w:val="1F4E79"/>
+                <w:sz w:val="17"/>
+                <w:szCs w:val="17"/>
+              </w:rPr>
+              <w:t xml:space="preserve">bootstrap/app.php</w:t>
+            </w:r>
+            <w:r>
+              <w:rPr>
+                <w:sz w:val="19"/>
+                <w:szCs w:val="19"/>
+              </w:rPr>
+              <w:t xml:space="preserve">: pengguna dikembalikan ke halaman sebelumnya dengan pesan jelas dan isian tetap terisi (kecuali password dan file)</w:t>
+            </w:r>
+          </w:p>
+        </w:tc>
+      </w:tr>
     </w:tbl>
     <w:p>
       <w:pPr>
@@ -26499,6 +26650,91 @@
                 <w:sz w:val="17"/>
                 <w:szCs w:val="17"/>
               </w:rPr>
+              <w:t xml:space="preserve">tests/Feature/SesiKedaluwarsaTest.php</w:t>
+            </w:r>
+          </w:p>
+        </w:tc>
+        <w:tc>
+          <w:tcPr>
+            <w:tcW w:type="dxa" w:w="5257"/>
+            <w:tcBorders>
+              <w:top w:val="single" w:color="BFBFBF" w:sz="4"/>
+              <w:left w:val="single" w:color="BFBFBF" w:sz="4"/>
+              <w:bottom w:val="single" w:color="BFBFBF" w:sz="4"/>
+              <w:right w:val="single" w:color="BFBFBF" w:sz="4"/>
+            </w:tcBorders>
+            <w:tcMar>
+              <w:top w:type="dxa" w:w="60"/>
+              <w:left w:type="dxa" w:w="100"/>
+              <w:bottom w:type="dxa" w:w="60"/>
+              <w:right w:type="dxa" w:w="100"/>
+            </w:tcMar>
+          </w:tcPr>
+          <w:p>
+            <w:r>
+              <w:rPr>
+                <w:sz w:val="19"/>
+                <w:szCs w:val="19"/>
+              </w:rPr>
+              <w:t xml:space="preserve">Token kedaluwarsa dikembalikan ke halaman sebelumnya dengan pesan, password tidak ikut disimpan, permintaan JSON tetap 419</w:t>
+            </w:r>
+          </w:p>
+        </w:tc>
+        <w:tc>
+          <w:tcPr>
+            <w:tcW w:type="dxa" w:w="964"/>
+            <w:tcBorders>
+              <w:top w:val="single" w:color="BFBFBF" w:sz="4"/>
+              <w:left w:val="single" w:color="BFBFBF" w:sz="4"/>
+              <w:bottom w:val="single" w:color="BFBFBF" w:sz="4"/>
+              <w:right w:val="single" w:color="BFBFBF" w:sz="4"/>
+            </w:tcBorders>
+            <w:tcMar>
+              <w:top w:type="dxa" w:w="60"/>
+              <w:left w:type="dxa" w:w="100"/>
+              <w:bottom w:type="dxa" w:w="60"/>
+              <w:right w:type="dxa" w:w="100"/>
+            </w:tcMar>
+          </w:tcPr>
+          <w:p>
+            <w:r>
+              <w:rPr>
+                <w:sz w:val="19"/>
+                <w:szCs w:val="19"/>
+              </w:rPr>
+              <w:t xml:space="preserve">3</w:t>
+            </w:r>
+          </w:p>
+        </w:tc>
+      </w:tr>
+      <w:tr>
+        <w:trPr>
+          <w:tblHeader w:val="off"/>
+        </w:trPr>
+        <w:tc>
+          <w:tcPr>
+            <w:tcW w:type="dxa" w:w="3417"/>
+            <w:tcBorders>
+              <w:top w:val="single" w:color="BFBFBF" w:sz="4"/>
+              <w:left w:val="single" w:color="BFBFBF" w:sz="4"/>
+              <w:bottom w:val="single" w:color="BFBFBF" w:sz="4"/>
+              <w:right w:val="single" w:color="BFBFBF" w:sz="4"/>
+            </w:tcBorders>
+            <w:tcMar>
+              <w:top w:type="dxa" w:w="60"/>
+              <w:left w:type="dxa" w:w="100"/>
+              <w:bottom w:type="dxa" w:w="60"/>
+              <w:right w:type="dxa" w:w="100"/>
+            </w:tcMar>
+          </w:tcPr>
+          <w:p>
+            <w:r>
+              <w:rPr>
+                <w:rFonts w:ascii="Consolas" w:cs="Consolas" w:eastAsia="Consolas" w:hAnsi="Consolas"/>
+                <w:color w:val="1F4E79"/>
+                <w:sz w:val="17"/>
+                <w:szCs w:val="17"/>
+              </w:rPr>
               <w:t xml:space="preserve">tests/Feature/TransaksiBarangTest.php</w:t>
             </w:r>
           </w:p>
@@ -26571,7 +26807,7 @@
           <w:b/>
           <w:bCs/>
         </w:rPr>
-        <w:t xml:space="preserve">Tests: 62 passed (203 assertions)</w:t>
+        <w:t xml:space="preserve">Tests: 65 passed (214 assertions)</w:t>
       </w:r>
       <w:r>
         <w:t xml:space="preserve">, lulus di SQLite (lokal) dan PostgreSQL (seperti database online).</w:t>
@@ -27775,7 +28011,7 @@
         <w:t xml:space="preserve">php artisan test</w:t>
       </w:r>
       <w:r>
-        <w:t xml:space="preserve"> dan tunjukkan 62 test lulus.</w:t>
+        <w:t xml:space="preserve"> dan tunjukkan 65 test lulus.</w:t>
       </w:r>
     </w:p>
     <w:p>

</xml_diff>